<commit_message>
Revise final CVs after first review round
Disable ligatures that broke words for stream-order parsers, move the
employer description off the company field, restore dropped details,
align wording with the verified evidence, and keep every file to one page.

Co-Authored-By: Claude Opus 5.5 <noreply@anthropic.com>
Claude-Session: https://claude.ai/code/session_01NmZBJB2p9fUf4J3WKnmd8Z
</commit_message>
<xml_diff>
--- a/output/final-cvs/CV_AI_TruongVanTinh.docx
+++ b/output/final-cvs/CV_AI_TruongVanTinh.docx
@@ -67,7 +67,7 @@
         </w:rPr>
         <w:t xml:space="preserve">+84 931 467 024 | </w:t>
       </w:r>
-      <w:hyperlink w:history="1" r:id="rId0n4kywypfwcr7fxkicr34">
+      <w:hyperlink w:history="1" r:id="rIduq6dwlal3olm1mnsqyza1">
         <w:r>
           <w:rPr>
             <w:rStyle w:val="Hyperlink"/>
@@ -91,7 +91,7 @@
       <w:pPr>
         <w:spacing w:after="0" w:before="0" w:line="252"/>
       </w:pPr>
-      <w:hyperlink w:history="1" r:id="rId5sv5r4cjn-vqt0toc2vrf">
+      <w:hyperlink w:history="1" r:id="rIdvhrkvzkdt-jt-2ykhcgcd">
         <w:r>
           <w:rPr>
             <w:rStyle w:val="Hyperlink"/>
@@ -110,7 +110,7 @@
         </w:rPr>
         <w:t xml:space="preserve"> | </w:t>
       </w:r>
-      <w:hyperlink w:history="1" r:id="rId4tp5jkxyptq9k639k6fhs">
+      <w:hyperlink w:history="1" r:id="rId3hluvuatiogodhxxsn8hb">
         <w:r>
           <w:rPr>
             <w:rStyle w:val="Hyperlink"/>
@@ -150,7 +150,7 @@
           <w:sz w:val="20"/>
           <w:szCs w:val="20"/>
         </w:rPr>
-        <w:t xml:space="preserve">Software engineer with 3+ years of development who applies AI at Con Cung, Vietnam's mother-and-baby retail chain (vector semantic search, n8n market-intelligence pipelines, a Claude + MCP debugging loop), and builds evaluated LLM applications in Python and FastAPI: RAG with Qdrant, LangChain, citations and groundedness checks, and LLM ticket triage with human review.</w:t>
+        <w:t xml:space="preserve">Software engineer with 3+ years of software development (since Sep 2023) who applies AI at Con Cung (vector semantic search, n8n market-intelligence pipelines, a Claude + MCP debug-and-test loop) and builds evaluated GenAI apps in Python and FastAPI: RAG with Qdrant, LangChain, citations and groundedness checks, and LLM ticket triage with human review.</w:t>
       </w:r>
     </w:p>
     <w:p>
@@ -199,14 +199,6 @@
       <w:r>
         <w:rPr>
           <w:rFonts w:ascii="Calibri" w:cs="Calibri" w:eastAsia="Calibri" w:hAnsi="Calibri"/>
-          <w:sz w:val="20"/>
-          <w:szCs w:val="20"/>
-        </w:rPr>
-        <w:t xml:space="preserve">, Vietnam's mother-and-baby retail chain</w:t>
-      </w:r>
-      <w:r>
-        <w:rPr>
-          <w:rFonts w:ascii="Calibri" w:cs="Calibri" w:eastAsia="Calibri" w:hAnsi="Calibri"/>
         </w:rPr>
         <w:t xml:space="preserve">	</w:t>
       </w:r>
@@ -231,25 +223,25 @@
           <w:sz w:val="19"/>
           <w:szCs w:val="19"/>
         </w:rPr>
-        <w:t xml:space="preserve">Tech: .NET, AngularJS, SQL Server, Dapper, Keycloak, n8n, Claude + MCP</w:t>
-      </w:r>
-    </w:p>
-    <w:p>
-      <w:pPr>
-        <w:pStyle w:val="ListParagraph"/>
-        <w:numPr>
-          <w:ilvl w:val="0"/>
-          <w:numId w:val="2"/>
-        </w:numPr>
-        <w:spacing w:after="0" w:before="4" w:line="252"/>
-      </w:pPr>
-      <w:r>
-        <w:rPr>
-          <w:rFonts w:ascii="Calibri" w:cs="Calibri" w:eastAsia="Calibri" w:hAnsi="Calibri"/>
-          <w:sz w:val="20"/>
-          <w:szCs w:val="20"/>
-        </w:rPr>
-        <w:t xml:space="preserve">Added vector semantic search to a commerce portal so products and content are found by meaning, not exact keywords.</w:t>
+        <w:t xml:space="preserve">Vietnam's mother-and-baby retail chain. Tech: .NET, AngularJS, SQL Server, Dapper, Keycloak, n8n, Claude + MCP</w:t>
+      </w:r>
+    </w:p>
+    <w:p>
+      <w:pPr>
+        <w:pStyle w:val="ListParagraph"/>
+        <w:numPr>
+          <w:ilvl w:val="0"/>
+          <w:numId w:val="2"/>
+        </w:numPr>
+        <w:spacing w:after="0" w:before="4" w:line="252"/>
+      </w:pPr>
+      <w:r>
+        <w:rPr>
+          <w:rFonts w:ascii="Calibri" w:cs="Calibri" w:eastAsia="Calibri" w:hAnsi="Calibri"/>
+          <w:sz w:val="20"/>
+          <w:szCs w:val="20"/>
+        </w:rPr>
+        <w:t xml:space="preserve">Applied vector semantic search in a commerce portal, matching search queries by meaning rather than exact keywords.</w:t>
       </w:r>
     </w:p>
     <w:p>
@@ -467,7 +459,7 @@
         </w:rPr>
         <w:t xml:space="preserve">	</w:t>
       </w:r>
-      <w:hyperlink w:history="1" r:id="rIdyz5onfewmeoscyxmdoa0j">
+      <w:hyperlink w:history="1" r:id="rIdpgs-a8qulab0tlxikwhao">
         <w:r>
           <w:rPr>
             <w:rStyle w:val="Hyperlink"/>
@@ -548,7 +540,7 @@
           <w:sz w:val="20"/>
           <w:szCs w:val="20"/>
         </w:rPr>
-        <w:t xml:space="preserve">Evaluated 16 questions on hit rate, MRR, abstention, fact recall and groundedness, which rejects wrong numbers and uncited claims; 29 tests in two CI jobs.</w:t>
+        <w:t xml:space="preserve">Built a 16-question synthetic eval (hit rate, MRR, abstention, fact recall, lexical groundedness that rejects wrong numbers and uncited claims) that gates CI; 29 tests in two jobs.</w:t>
       </w:r>
     </w:p>
     <w:p>
@@ -574,7 +566,7 @@
           <w:sz w:val="20"/>
           <w:szCs w:val="20"/>
         </w:rPr>
-        <w:t xml:space="preserve"> | Personal project | Python, FastAPI, LLM, SQLite, Docker</w:t>
+        <w:t xml:space="preserve"> | Personal project | Python, FastAPI, Pydantic, LLM, SQLite</w:t>
       </w:r>
       <w:r>
         <w:rPr>
@@ -582,7 +574,7 @@
         </w:rPr>
         <w:t xml:space="preserve">	</w:t>
       </w:r>
-      <w:hyperlink w:history="1" r:id="rIdf3eixcwyjtcnkq3xpfn8i">
+      <w:hyperlink w:history="1" r:id="rIdp9jf72zqq4gvek8b65tac">
         <w:r>
           <w:rPr>
             <w:rStyle w:val="Hyperlink"/>
@@ -609,25 +601,25 @@
           <w:sz w:val="20"/>
           <w:szCs w:val="20"/>
         </w:rPr>
-        <w:t xml:space="preserve">Triaged tickets (4 categories + other, priority, sentiment) with a rules baseline or an LLM whose output is schema-validated.</w:t>
-      </w:r>
-    </w:p>
-    <w:p>
-      <w:pPr>
-        <w:pStyle w:val="ListParagraph"/>
-        <w:numPr>
-          <w:ilvl w:val="0"/>
-          <w:numId w:val="2"/>
-        </w:numPr>
-        <w:spacing w:after="0" w:before="4" w:line="252"/>
-      </w:pPr>
-      <w:r>
-        <w:rPr>
-          <w:rFonts w:ascii="Calibri" w:cs="Calibri" w:eastAsia="Calibri" w:hAnsi="Calibri"/>
-          <w:sz w:val="20"/>
-          <w:szCs w:val="20"/>
-        </w:rPr>
-        <w:t xml:space="preserve">Forced human review for urgent keywords, masked emails and phone numbers before the model call, token-protected the review API and stored decisions without message text.</w:t>
+        <w:t xml:space="preserve">Triaged tickets (4 categories + other, priority, sentiment) with schema-validated LLM output and a rules fallback.</w:t>
+      </w:r>
+    </w:p>
+    <w:p>
+      <w:pPr>
+        <w:pStyle w:val="ListParagraph"/>
+        <w:numPr>
+          <w:ilvl w:val="0"/>
+          <w:numId w:val="2"/>
+        </w:numPr>
+        <w:spacing w:after="0" w:before="4" w:line="252"/>
+      </w:pPr>
+      <w:r>
+        <w:rPr>
+          <w:rFonts w:ascii="Calibri" w:cs="Calibri" w:eastAsia="Calibri" w:hAnsi="Calibri"/>
+          <w:sz w:val="20"/>
+          <w:szCs w:val="20"/>
+        </w:rPr>
+        <w:t xml:space="preserve">Forced human review for urgent keywords, masked emails and phone numbers before the model call, token-protected the review API and stored decisions without message text; 7 tests and a 5-case eval in CI.</w:t>
       </w:r>
     </w:p>
     <w:p>
@@ -653,25 +645,25 @@
           <w:sz w:val="20"/>
           <w:szCs w:val="20"/>
         </w:rPr>
-        <w:t xml:space="preserve"> | AI-assisted lab | FastAPI, Redis, SQLite, Docker Compose</w:t>
-      </w:r>
-    </w:p>
-    <w:p>
-      <w:pPr>
-        <w:pStyle w:val="ListParagraph"/>
-        <w:numPr>
-          <w:ilvl w:val="0"/>
-          <w:numId w:val="2"/>
-        </w:numPr>
-        <w:spacing w:after="0" w:before="4" w:line="252"/>
-      </w:pPr>
-      <w:r>
-        <w:rPr>
-          <w:rFonts w:ascii="Calibri" w:cs="Calibri" w:eastAsia="Calibri" w:hAnsi="Calibri"/>
-          <w:sz w:val="20"/>
-          <w:szCs w:val="20"/>
-        </w:rPr>
-        <w:t xml:space="preserve">Validated Redis cache-aside (60-second TTL, invalidation, outage fallback) in 22 tests on real Redis; cut median SQLite lookup from 3.63 ms to 0.005 ms on 100,000 synthetic rows.</w:t>
+        <w:t xml:space="preserve"> | AI-assisted lab, no public repo | FastAPI, Redis, SQLite</w:t>
+      </w:r>
+    </w:p>
+    <w:p>
+      <w:pPr>
+        <w:pStyle w:val="ListParagraph"/>
+        <w:numPr>
+          <w:ilvl w:val="0"/>
+          <w:numId w:val="2"/>
+        </w:numPr>
+        <w:spacing w:after="0" w:before="4" w:line="252"/>
+      </w:pPr>
+      <w:r>
+        <w:rPr>
+          <w:rFonts w:ascii="Calibri" w:cs="Calibri" w:eastAsia="Calibri" w:hAnsi="Calibri"/>
+          <w:sz w:val="20"/>
+          <w:szCs w:val="20"/>
+        </w:rPr>
+        <w:t xml:space="preserve">Validated Redis cache-aside (60-second TTL, invalidation, outage fallback) in 22 tests on real Redis; cut median SQLite lookup 3.63 → 0.005 ms (200 queries, 100,000 synthetic rows); wrote undeployed Compose/Azure templates.</w:t>
       </w:r>
     </w:p>
     <w:p>
@@ -688,7 +680,7 @@
         </w:rPr>
         <w:t xml:space="preserve">Other projects: </w:t>
       </w:r>
-      <w:hyperlink w:history="1" r:id="rIdeupzvekgapn_jh1gusgsa">
+      <w:hyperlink w:history="1" r:id="rId_jbgnamzpra_fsnmxf4fh">
         <w:r>
           <w:rPr>
             <w:rStyle w:val="Hyperlink"/>
@@ -707,7 +699,7 @@
         </w:rPr>
         <w:t xml:space="preserve"> (.NET 8 idempotent partner API with RabbitMQ, Polly and 42 xUnit tests); </w:t>
       </w:r>
-      <w:hyperlink w:history="1" r:id="rIdkuaxvm6gquoxiezro5kta">
+      <w:hyperlink w:history="1" r:id="rIdlzzsoghw8_acjivq98iyi">
         <w:r>
           <w:rPr>
             <w:rStyle w:val="Hyperlink"/>
@@ -724,9 +716,9 @@
           <w:sz w:val="19"/>
           <w:szCs w:val="19"/>
         </w:rPr>
-        <w:t xml:space="preserve"> (Angular 19 search-management admin with RxJS and NgRx SignalStore); </w:t>
-      </w:r>
-      <w:hyperlink w:history="1" r:id="rIdavw78ivrz3iq6c107x0mp">
+        <w:t xml:space="preserve"> (Angular 19 search-admin screens with RxJS and NgRx SignalStore); </w:t>
+      </w:r>
+      <w:hyperlink w:history="1" r:id="rId9c7zzw5f095o__ntf7pwd">
         <w:r>
           <w:rPr>
             <w:rStyle w:val="Hyperlink"/>
@@ -807,7 +799,7 @@
           <w:sz w:val="19"/>
           <w:szCs w:val="19"/>
         </w:rPr>
-        <w:t xml:space="preserve">Python, FastAPI, LangChain, Qdrant, Vector Databases, SentenceTransformers, OpenAI-compatible APIs, SQLite, REST APIs, Input Validation, n8n, MCP, Claude, OpenAI (ChatGPT, Custom GPTs), Cursor, GitHub Copilot, OpenClaw, Agent Skills</w:t>
+        <w:t xml:space="preserve">Python, FastAPI, Pydantic, LangChain, Qdrant, Vector Databases, SentenceTransformers, OpenAI-compatible APIs, SQLite, REST APIs, Input Validation, n8n, MCP, Claude, OpenAI (ChatGPT, Custom GPTs), Cursor, GitHub Copilot, Agent Skills</w:t>
       </w:r>
     </w:p>
     <w:p>
@@ -830,7 +822,7 @@
           <w:sz w:val="19"/>
           <w:szCs w:val="19"/>
         </w:rPr>
-        <w:t xml:space="preserve">C#, .NET, ASP.NET Core, Dapper, SQL Server, PostgreSQL, Redis, Database Design, Query Optimization, IIS</w:t>
+        <w:t xml:space="preserve">C#, .NET, ASP.NET Core, Dapper, SQL Server, PostgreSQL, Redis, Database Design, Query Optimization, IIS, Azure, AWS</w:t>
       </w:r>
     </w:p>
     <w:p>
@@ -876,7 +868,7 @@
           <w:sz w:val="19"/>
           <w:szCs w:val="19"/>
         </w:rPr>
-        <w:t xml:space="preserve">Unit Testing, Integration Testing, Docker, CI/CD, GitHub Actions, Git, Logging, Monitoring/Observability, Azure, AWS</w:t>
+        <w:t xml:space="preserve">Unit Testing, Integration Testing, Docker, CI/CD, GitHub Actions, Git, Logging, Monitoring/Observability</w:t>
       </w:r>
     </w:p>
     <w:p>
@@ -940,7 +932,7 @@
           <w:sz w:val="21"/>
           <w:szCs w:val="21"/>
         </w:rPr>
-        <w:t xml:space="preserve">EDUCATION AND LANGUAGES</w:t>
+        <w:t xml:space="preserve">EDUCATION</w:t>
       </w:r>
     </w:p>
     <w:p>
@@ -978,15 +970,15 @@
           <w:sz w:val="20"/>
           <w:szCs w:val="20"/>
         </w:rPr>
-        <w:t xml:space="preserve">English: </w:t>
-      </w:r>
-      <w:r>
-        <w:rPr>
-          <w:rFonts w:ascii="Calibri" w:cs="Calibri" w:eastAsia="Calibri" w:hAnsi="Calibri"/>
-          <w:sz w:val="20"/>
-          <w:szCs w:val="20"/>
-        </w:rPr>
-        <w:t xml:space="preserve">good reading and writing of technical documents; basic spoken communication</w:t>
+        <w:t xml:space="preserve">Languages: </w:t>
+      </w:r>
+      <w:r>
+        <w:rPr>
+          <w:rFonts w:ascii="Calibri" w:cs="Calibri" w:eastAsia="Calibri" w:hAnsi="Calibri"/>
+          <w:sz w:val="20"/>
+          <w:szCs w:val="20"/>
+        </w:rPr>
+        <w:t xml:space="preserve">English (good reading and writing of technical documents; basic spoken communication)</w:t>
       </w:r>
     </w:p>
     <w:sectPr>

</xml_diff>

<commit_message>
Apply second-round review fixes to backend and full stack CVs
Co-Authored-By: Claude Opus 5.5 <noreply@anthropic.com>
Claude-Session: https://claude.ai/code/session_01NmZBJB2p9fUf4J3WKnmd8Z
</commit_message>
<xml_diff>
--- a/output/final-cvs/CV_AI_TruongVanTinh.docx
+++ b/output/final-cvs/CV_AI_TruongVanTinh.docx
@@ -67,7 +67,7 @@
         </w:rPr>
         <w:t xml:space="preserve">+84 931 467 024 | </w:t>
       </w:r>
-      <w:hyperlink w:history="1" r:id="rIduq6dwlal3olm1mnsqyza1">
+      <w:hyperlink w:history="1" r:id="rIdiq3sllxktfozrbdgnwhlk">
         <w:r>
           <w:rPr>
             <w:rStyle w:val="Hyperlink"/>
@@ -91,7 +91,7 @@
       <w:pPr>
         <w:spacing w:after="0" w:before="0" w:line="252"/>
       </w:pPr>
-      <w:hyperlink w:history="1" r:id="rIdvhrkvzkdt-jt-2ykhcgcd">
+      <w:hyperlink w:history="1" r:id="rIdfxnmo80gb85ivfmpb3zmp">
         <w:r>
           <w:rPr>
             <w:rStyle w:val="Hyperlink"/>
@@ -110,7 +110,7 @@
         </w:rPr>
         <w:t xml:space="preserve"> | </w:t>
       </w:r>
-      <w:hyperlink w:history="1" r:id="rId3hluvuatiogodhxxsn8hb">
+      <w:hyperlink w:history="1" r:id="rIdipcieehwjktpytwc_usqz">
         <w:r>
           <w:rPr>
             <w:rStyle w:val="Hyperlink"/>
@@ -459,7 +459,7 @@
         </w:rPr>
         <w:t xml:space="preserve">	</w:t>
       </w:r>
-      <w:hyperlink w:history="1" r:id="rIdpgs-a8qulab0tlxikwhao">
+      <w:hyperlink w:history="1" r:id="rIdqkr1xtsjxyhtcdgrnq8-_">
         <w:r>
           <w:rPr>
             <w:rStyle w:val="Hyperlink"/>
@@ -574,7 +574,7 @@
         </w:rPr>
         <w:t xml:space="preserve">	</w:t>
       </w:r>
-      <w:hyperlink w:history="1" r:id="rIdp9jf72zqq4gvek8b65tac">
+      <w:hyperlink w:history="1" r:id="rIdbh0zn5p1xiljoxv0i2ycc">
         <w:r>
           <w:rPr>
             <w:rStyle w:val="Hyperlink"/>
@@ -680,7 +680,7 @@
         </w:rPr>
         <w:t xml:space="preserve">Other projects: </w:t>
       </w:r>
-      <w:hyperlink w:history="1" r:id="rId_jbgnamzpra_fsnmxf4fh">
+      <w:hyperlink w:history="1" r:id="rIdc8qhyaclaqaalgaqcfgqk">
         <w:r>
           <w:rPr>
             <w:rStyle w:val="Hyperlink"/>
@@ -699,7 +699,7 @@
         </w:rPr>
         <w:t xml:space="preserve"> (.NET 8 idempotent partner API with RabbitMQ, Polly and 42 xUnit tests); </w:t>
       </w:r>
-      <w:hyperlink w:history="1" r:id="rIdlzzsoghw8_acjivq98iyi">
+      <w:hyperlink w:history="1" r:id="rIdbisyhsgyygu2mybrdq0j8">
         <w:r>
           <w:rPr>
             <w:rStyle w:val="Hyperlink"/>
@@ -718,7 +718,7 @@
         </w:rPr>
         <w:t xml:space="preserve"> (Angular 19 search-admin screens with RxJS and NgRx SignalStore); </w:t>
       </w:r>
-      <w:hyperlink w:history="1" r:id="rId9c7zzw5f095o__ntf7pwd">
+      <w:hyperlink w:history="1" r:id="rIdaph6wuc88m4bkacdr2fby">
         <w:r>
           <w:rPr>
             <w:rStyle w:val="Hyperlink"/>

</xml_diff>

<commit_message>
Apply second-round review fixes to the AI CV
Co-Authored-By: Claude Opus 5.5 <noreply@anthropic.com>
Claude-Session: https://claude.ai/code/session_01NmZBJB2p9fUf4J3WKnmd8Z
</commit_message>
<xml_diff>
--- a/output/final-cvs/CV_AI_TruongVanTinh.docx
+++ b/output/final-cvs/CV_AI_TruongVanTinh.docx
@@ -67,7 +67,7 @@
         </w:rPr>
         <w:t xml:space="preserve">+84 931 467 024 | </w:t>
       </w:r>
-      <w:hyperlink w:history="1" r:id="rIdiq3sllxktfozrbdgnwhlk">
+      <w:hyperlink w:history="1" r:id="rIdgsjqj-vx4a5_p_p36gy3v">
         <w:r>
           <w:rPr>
             <w:rStyle w:val="Hyperlink"/>
@@ -91,7 +91,7 @@
       <w:pPr>
         <w:spacing w:after="0" w:before="0" w:line="252"/>
       </w:pPr>
-      <w:hyperlink w:history="1" r:id="rIdfxnmo80gb85ivfmpb3zmp">
+      <w:hyperlink w:history="1" r:id="rIdry9zww58c-tqeaedxiucq">
         <w:r>
           <w:rPr>
             <w:rStyle w:val="Hyperlink"/>
@@ -110,7 +110,7 @@
         </w:rPr>
         <w:t xml:space="preserve"> | </w:t>
       </w:r>
-      <w:hyperlink w:history="1" r:id="rIdipcieehwjktpytwc_usqz">
+      <w:hyperlink w:history="1" r:id="rIdkihgiajjxwsqunthcqpy2">
         <w:r>
           <w:rPr>
             <w:rStyle w:val="Hyperlink"/>
@@ -150,7 +150,7 @@
           <w:sz w:val="20"/>
           <w:szCs w:val="20"/>
         </w:rPr>
-        <w:t xml:space="preserve">Software engineer with 3+ years of software development (since Sep 2023) who applies AI at Con Cung (vector semantic search, n8n market-intelligence pipelines, a Claude + MCP debug-and-test loop) and builds evaluated GenAI apps in Python and FastAPI: RAG with Qdrant, LangChain, citations and groundedness checks, and LLM ticket triage with human review.</w:t>
+        <w:t xml:space="preserve">Software engineer with 3+ years of software development (since Sep 2023) who applies AI at Con Cung (vector semantic search, n8n market-intelligence pipelines, a Claude + MCP debug-and-test loop) and builds evaluated generative AI (GenAI) apps in Python and FastAPI: RAG with Qdrant, LangChain, citations and groundedness checks, and LLM ticket triage with human review.</w:t>
       </w:r>
     </w:p>
     <w:p>
@@ -313,7 +313,7 @@
           <w:sz w:val="20"/>
           <w:szCs w:val="20"/>
         </w:rPr>
-        <w:t xml:space="preserve">Delivered AngularJS / .NET voucher workflows, 7 subscription benefit calculations and a 4-template code preview tool.</w:t>
+        <w:t xml:space="preserve">Delivered AngularJS / .NET voucher workflows, 7 subscription benefit calculations, a preview tool for 4 code templates.</w:t>
       </w:r>
     </w:p>
     <w:p>
@@ -459,7 +459,7 @@
         </w:rPr>
         <w:t xml:space="preserve">	</w:t>
       </w:r>
-      <w:hyperlink w:history="1" r:id="rIdqkr1xtsjxyhtcdgrnq8-_">
+      <w:hyperlink w:history="1" r:id="rIdtc-1w6ez0qwfjazkkg9r0">
         <w:r>
           <w:rPr>
             <w:rStyle w:val="Hyperlink"/>
@@ -540,7 +540,7 @@
           <w:sz w:val="20"/>
           <w:szCs w:val="20"/>
         </w:rPr>
-        <w:t xml:space="preserve">Built a 16-question synthetic eval (hit rate, MRR, abstention, fact recall, lexical groundedness that rejects wrong numbers and uncited claims) that gates CI; 29 tests in two jobs.</w:t>
+        <w:t xml:space="preserve">Built a 16-question synthetic eval (hit rate, MRR, abstention, fact recall, lexical groundedness that rejects wrong numbers and uncited claims) gating CI on the offline pipeline; 29 tests, LLM path tested with fake models.</w:t>
       </w:r>
     </w:p>
     <w:p>
@@ -574,7 +574,7 @@
         </w:rPr>
         <w:t xml:space="preserve">	</w:t>
       </w:r>
-      <w:hyperlink w:history="1" r:id="rIdbh0zn5p1xiljoxv0i2ycc">
+      <w:hyperlink w:history="1" r:id="rIdqxm_yr5yvzcodkydah-6l">
         <w:r>
           <w:rPr>
             <w:rStyle w:val="Hyperlink"/>
@@ -619,7 +619,7 @@
           <w:sz w:val="20"/>
           <w:szCs w:val="20"/>
         </w:rPr>
-        <w:t xml:space="preserve">Forced human review for urgent keywords, masked emails and phone numbers before the model call, token-protected the review API and stored decisions without message text; 7 tests and a 5-case eval in CI.</w:t>
+        <w:t xml:space="preserve">Forced human review for urgent keywords, masked emails and phone numbers before the model call, token-protected the review API and stored decisions without message text; 7 tests and a 5-case rules-baseline eval in CI.</w:t>
       </w:r>
     </w:p>
     <w:p>
@@ -663,7 +663,7 @@
           <w:sz w:val="20"/>
           <w:szCs w:val="20"/>
         </w:rPr>
-        <w:t xml:space="preserve">Validated Redis cache-aside (60-second TTL, invalidation, outage fallback) in 22 tests on real Redis; cut median SQLite lookup 3.63 → 0.005 ms (200 queries, 100,000 synthetic rows); wrote undeployed Compose/Azure templates.</w:t>
+        <w:t xml:space="preserve">Validated Redis cache-aside (60-second TTL, invalidation, outage fallback) in 22 tests on real Redis; cut median SQLite lookup from 3.63 to 0.005 ms (200 queries, 100,000 synthetic rows); wrote undeployed Compose/Azure templates.</w:t>
       </w:r>
     </w:p>
     <w:p>
@@ -680,7 +680,7 @@
         </w:rPr>
         <w:t xml:space="preserve">Other projects: </w:t>
       </w:r>
-      <w:hyperlink w:history="1" r:id="rIdc8qhyaclaqaalgaqcfgqk">
+      <w:hyperlink w:history="1" r:id="rIdps59bp8oxbwqvawtzdbfx">
         <w:r>
           <w:rPr>
             <w:rStyle w:val="Hyperlink"/>
@@ -697,9 +697,9 @@
           <w:sz w:val="19"/>
           <w:szCs w:val="19"/>
         </w:rPr>
-        <w:t xml:space="preserve"> (.NET 8 idempotent partner API with RabbitMQ, Polly and 42 xUnit tests); </w:t>
-      </w:r>
-      <w:hyperlink w:history="1" r:id="rIdbisyhsgyygu2mybrdq0j8">
+        <w:t xml:space="preserve"> (.NET 8 API: idempotency, RabbitMQ, Polly, 42 xUnit tests); </w:t>
+      </w:r>
+      <w:hyperlink w:history="1" r:id="rIdznebwbdh-plldw5miegzh">
         <w:r>
           <w:rPr>
             <w:rStyle w:val="Hyperlink"/>
@@ -718,7 +718,7 @@
         </w:rPr>
         <w:t xml:space="preserve"> (Angular 19 search-admin screens with RxJS and NgRx SignalStore); </w:t>
       </w:r>
-      <w:hyperlink w:history="1" r:id="rIdaph6wuc88m4bkacdr2fby">
+      <w:hyperlink w:history="1" r:id="rId2tau22sp-ofxqt_ezm5vf">
         <w:r>
           <w:rPr>
             <w:rStyle w:val="Hyperlink"/>
@@ -776,7 +776,7 @@
           <w:sz w:val="19"/>
           <w:szCs w:val="19"/>
         </w:rPr>
-        <w:t xml:space="preserve">RAG, LLM Integration, Prompt Engineering, Document Parsing, Data Preprocessing, Chunking, Semantic Embeddings, TF-IDF, Vector Search, Document Retrieval, NLP (text retrieval), Output Validation, Abstention and Fallbacks, Human-in-the-loop Workflows, Data Pipelines, AI Agents, Retrieval Evaluation (hit rate, MRR), Fact Recall, Groundedness Evaluation</w:t>
+        <w:t xml:space="preserve">RAG (Retrieval-Augmented Generation), LLM Integration, Prompt Engineering, Document Parsing, Data Preprocessing, Chunking, Semantic Embeddings, TF-IDF, Vector Search, Document Retrieval, NLP (text retrieval), Output Validation, Abstention and Fallbacks, Human-in-the-loop Workflows, Data Pipelines, AI Agents, RAG Evaluation (hit rate, MRR, fact recall, groundedness)</w:t>
       </w:r>
     </w:p>
     <w:p>

</xml_diff>

<commit_message>
Finish CV review: final QA, scorecard, iteration log and reports
Apply the last minor review fixes, add a repeatable QA script that checks
the delivered PDF and DOCX files, and record scores, iterations, market
findings and the evidence still needed from the candidate.

Co-Authored-By: Claude Opus 5.5 <noreply@anthropic.com>
Claude-Session: https://claude.ai/code/session_01NmZBJB2p9fUf4J3WKnmd8Z
</commit_message>
<xml_diff>
--- a/output/final-cvs/CV_AI_TruongVanTinh.docx
+++ b/output/final-cvs/CV_AI_TruongVanTinh.docx
@@ -67,7 +67,7 @@
         </w:rPr>
         <w:t xml:space="preserve">+84 931 467 024 | </w:t>
       </w:r>
-      <w:hyperlink w:history="1" r:id="rIdgsjqj-vx4a5_p_p36gy3v">
+      <w:hyperlink w:history="1" r:id="rIdgh0aimfzb_rkytne-jp1b">
         <w:r>
           <w:rPr>
             <w:rStyle w:val="Hyperlink"/>
@@ -91,7 +91,7 @@
       <w:pPr>
         <w:spacing w:after="0" w:before="0" w:line="252"/>
       </w:pPr>
-      <w:hyperlink w:history="1" r:id="rIdry9zww58c-tqeaedxiucq">
+      <w:hyperlink w:history="1" r:id="rId3ywinm2w0vllqspna9lvi">
         <w:r>
           <w:rPr>
             <w:rStyle w:val="Hyperlink"/>
@@ -110,7 +110,7 @@
         </w:rPr>
         <w:t xml:space="preserve"> | </w:t>
       </w:r>
-      <w:hyperlink w:history="1" r:id="rIdkihgiajjxwsqunthcqpy2">
+      <w:hyperlink w:history="1" r:id="rId0x-tn6vuo3xsmatyx2iww">
         <w:r>
           <w:rPr>
             <w:rStyle w:val="Hyperlink"/>
@@ -259,7 +259,7 @@
           <w:sz w:val="20"/>
           <w:szCs w:val="20"/>
         </w:rPr>
-        <w:t xml:space="preserve">Built n8n pipelines that scrape competitor data for market-intelligence reporting.</w:t>
+        <w:t xml:space="preserve">Built n8n pipelines that scrape competitor data for market intelligence.</w:t>
       </w:r>
     </w:p>
     <w:p>
@@ -313,7 +313,7 @@
           <w:sz w:val="20"/>
           <w:szCs w:val="20"/>
         </w:rPr>
-        <w:t xml:space="preserve">Delivered AngularJS / .NET voucher workflows, 7 subscription benefit calculations, a preview tool for 4 code templates.</w:t>
+        <w:t xml:space="preserve">Delivered AngularJS / .NET voucher workflows, 7 subscription benefit calculations, plus a preview tool for 4 code templates.</w:t>
       </w:r>
     </w:p>
     <w:p>
@@ -459,7 +459,7 @@
         </w:rPr>
         <w:t xml:space="preserve">	</w:t>
       </w:r>
-      <w:hyperlink w:history="1" r:id="rIdtc-1w6ez0qwfjazkkg9r0">
+      <w:hyperlink w:history="1" r:id="rIdtruwzeai8yda2ch1_zgz_">
         <w:r>
           <w:rPr>
             <w:rStyle w:val="Hyperlink"/>
@@ -574,7 +574,7 @@
         </w:rPr>
         <w:t xml:space="preserve">	</w:t>
       </w:r>
-      <w:hyperlink w:history="1" r:id="rIdqxm_yr5yvzcodkydah-6l">
+      <w:hyperlink w:history="1" r:id="rId1xwr-baglet3ans6x8uqq">
         <w:r>
           <w:rPr>
             <w:rStyle w:val="Hyperlink"/>
@@ -680,7 +680,7 @@
         </w:rPr>
         <w:t xml:space="preserve">Other projects: </w:t>
       </w:r>
-      <w:hyperlink w:history="1" r:id="rIdps59bp8oxbwqvawtzdbfx">
+      <w:hyperlink w:history="1" r:id="rIdf8pfkh1osj5kjt4rloufg">
         <w:r>
           <w:rPr>
             <w:rStyle w:val="Hyperlink"/>
@@ -699,7 +699,7 @@
         </w:rPr>
         <w:t xml:space="preserve"> (.NET 8 API: idempotency, RabbitMQ, Polly, 42 xUnit tests); </w:t>
       </w:r>
-      <w:hyperlink w:history="1" r:id="rIdznebwbdh-plldw5miegzh">
+      <w:hyperlink w:history="1" r:id="rIdcja0ei_raflnniunqhsc7">
         <w:r>
           <w:rPr>
             <w:rStyle w:val="Hyperlink"/>
@@ -718,7 +718,7 @@
         </w:rPr>
         <w:t xml:space="preserve"> (Angular 19 search-admin screens with RxJS and NgRx SignalStore); </w:t>
       </w:r>
-      <w:hyperlink w:history="1" r:id="rId2tau22sp-ofxqt_ezm5vf">
+      <w:hyperlink w:history="1" r:id="rId9iv6lufsvdid5medqaeni">
         <w:r>
           <w:rPr>
             <w:rStyle w:val="Hyperlink"/>
@@ -776,7 +776,7 @@
           <w:sz w:val="19"/>
           <w:szCs w:val="19"/>
         </w:rPr>
-        <w:t xml:space="preserve">RAG (Retrieval-Augmented Generation), LLM Integration, Prompt Engineering, Document Parsing, Data Preprocessing, Chunking, Semantic Embeddings, TF-IDF, Vector Search, Document Retrieval, NLP (text retrieval), Output Validation, Abstention and Fallbacks, Human-in-the-loop Workflows, Data Pipelines, AI Agents, RAG Evaluation (hit rate, MRR, fact recall, groundedness)</w:t>
+        <w:t xml:space="preserve">RAG (Retrieval-Augmented Generation), LLM Integration, Prompt Engineering, Document Parsing, Data Preprocessing, Chunking, Semantic Embeddings, TF-IDF, Cosine Similarity, Vector Search, Document Retrieval, NLP (text retrieval), Output Validation, Abstention and Fallbacks, Human-in-the-loop Workflows, Data Pipelines, AI Agents, RAG Evaluation (hit rate, MRR, fact recall, groundedness)</w:t>
       </w:r>
     </w:p>
     <w:p>

</xml_diff>

<commit_message>
Use the header-band design for the final designed CVs
The candidate preferred the earlier resumes/ layout. Rebuild it on the
final content, keeping text out of positioned elements so parsers read
bullets in order, and drop the heading letter-spacing and ligatures.
The designed PDFs are copied to resumes/ and the root, the paths
CLAUDE.md uses, and the old pipeline is retired.

Co-Authored-By: Claude Opus 5.5 <noreply@anthropic.com>
Claude-Session: https://claude.ai/code/session_01NmZBJB2p9fUf4J3WKnmd8Z
</commit_message>
<xml_diff>
--- a/output/final-cvs/CV_AI_TruongVanTinh.docx
+++ b/output/final-cvs/CV_AI_TruongVanTinh.docx
@@ -67,7 +67,7 @@
         </w:rPr>
         <w:t xml:space="preserve">+84 931 467 024 | </w:t>
       </w:r>
-      <w:hyperlink w:history="1" r:id="rIdgh0aimfzb_rkytne-jp1b">
+      <w:hyperlink w:history="1" r:id="rIdclopvwlqm4yw3gx-9ckum">
         <w:r>
           <w:rPr>
             <w:rStyle w:val="Hyperlink"/>
@@ -91,7 +91,7 @@
       <w:pPr>
         <w:spacing w:after="0" w:before="0" w:line="252"/>
       </w:pPr>
-      <w:hyperlink w:history="1" r:id="rId3ywinm2w0vllqspna9lvi">
+      <w:hyperlink w:history="1" r:id="rIdrgct5bm1s76j7mvqpc9zb">
         <w:r>
           <w:rPr>
             <w:rStyle w:val="Hyperlink"/>
@@ -110,7 +110,7 @@
         </w:rPr>
         <w:t xml:space="preserve"> | </w:t>
       </w:r>
-      <w:hyperlink w:history="1" r:id="rId0x-tn6vuo3xsmatyx2iww">
+      <w:hyperlink w:history="1" r:id="rIdkb_ymtiibbw_q18lqmvsd">
         <w:r>
           <w:rPr>
             <w:rStyle w:val="Hyperlink"/>
@@ -459,7 +459,7 @@
         </w:rPr>
         <w:t xml:space="preserve">	</w:t>
       </w:r>
-      <w:hyperlink w:history="1" r:id="rIdtruwzeai8yda2ch1_zgz_">
+      <w:hyperlink w:history="1" r:id="rIdzjjjciax62516kol0jaxt">
         <w:r>
           <w:rPr>
             <w:rStyle w:val="Hyperlink"/>
@@ -574,7 +574,7 @@
         </w:rPr>
         <w:t xml:space="preserve">	</w:t>
       </w:r>
-      <w:hyperlink w:history="1" r:id="rId1xwr-baglet3ans6x8uqq">
+      <w:hyperlink w:history="1" r:id="rIdvjhoxcro1sxeehe_-gsyp">
         <w:r>
           <w:rPr>
             <w:rStyle w:val="Hyperlink"/>
@@ -680,7 +680,7 @@
         </w:rPr>
         <w:t xml:space="preserve">Other projects: </w:t>
       </w:r>
-      <w:hyperlink w:history="1" r:id="rIdf8pfkh1osj5kjt4rloufg">
+      <w:hyperlink w:history="1" r:id="rIdspnkmqci3tgmefgeuaih3">
         <w:r>
           <w:rPr>
             <w:rStyle w:val="Hyperlink"/>
@@ -699,7 +699,7 @@
         </w:rPr>
         <w:t xml:space="preserve"> (.NET 8 API: idempotency, RabbitMQ, Polly, 42 xUnit tests); </w:t>
       </w:r>
-      <w:hyperlink w:history="1" r:id="rIdcja0ei_raflnniunqhsc7">
+      <w:hyperlink w:history="1" r:id="rIdtgdtovddbb8mp_vamu1bq">
         <w:r>
           <w:rPr>
             <w:rStyle w:val="Hyperlink"/>
@@ -718,7 +718,7 @@
         </w:rPr>
         <w:t xml:space="preserve"> (Angular 19 search-admin screens with RxJS and NgRx SignalStore); </w:t>
       </w:r>
-      <w:hyperlink w:history="1" r:id="rId9iv6lufsvdid5medqaeni">
+      <w:hyperlink w:history="1" r:id="rIdfhnnnkzo7jmxw_dekxrfx">
         <w:r>
           <w:rPr>
             <w:rStyle w:val="Hyperlink"/>

</xml_diff>